<commit_message>
Run coursework with native PostgreSQL without Docker
</commit_message>
<xml_diff>
--- a/docs/coursework/Пояснительная_записка.docx
+++ b/docs/coursework/Пояснительная_записка.docx
@@ -652,7 +652,7 @@
                 <w:color w:val="000000"/>
                 <w:sz w:val="22"/>
               </w:rPr>
-              <w:t>requirements*, compose.yaml, scripts/</w:t>
+              <w:t>requirements*, scripts/</w:t>
             </w:r>
           </w:p>
         </w:tc>
@@ -717,7 +717,7 @@
                 <w:color w:val="000000"/>
                 <w:sz w:val="22"/>
               </w:rPr>
-              <w:t>docs/*.md, OpenAPI, DDL</w:t>
+              <w:t>Руководства docs/, OpenAPI, DDL</w:t>
             </w:r>
           </w:p>
         </w:tc>
@@ -782,72 +782,7 @@
                 <w:color w:val="000000"/>
                 <w:sz w:val="22"/>
               </w:rPr>
-              <w:t>docs/diagrams, examples, evidence</w:t>
-            </w:r>
-          </w:p>
-        </w:tc>
-      </w:tr>
-      <w:tr>
-        <w:trPr>
-          <w:cantSplit/>
-        </w:trPr>
-        <w:tc>
-          <w:tcPr>
-            <w:tcW w:type="dxa" w:w="3118"/>
-          </w:tcPr>
-          <w:p>
-            <w:pPr>
-              <w:keepNext w:val="0"/>
-              <w:spacing w:after="60" w:before="60" w:line="240" w:lineRule="auto"/>
-            </w:pPr>
-            <w:r>
-              <w:rPr>
-                <w:rFonts w:ascii="Times New Roman" w:hAnsi="Times New Roman" w:eastAsia="Times New Roman"/>
-                <w:b w:val="0"/>
-                <w:color w:val="000000"/>
-                <w:sz w:val="22"/>
-              </w:rPr>
-              <w:t>8</w:t>
-            </w:r>
-          </w:p>
-        </w:tc>
-        <w:tc>
-          <w:tcPr>
-            <w:tcW w:type="dxa" w:w="3118"/>
-          </w:tcPr>
-          <w:p>
-            <w:pPr>
-              <w:keepNext w:val="0"/>
-              <w:spacing w:after="60" w:before="60" w:line="240" w:lineRule="auto"/>
-            </w:pPr>
-            <w:r>
-              <w:rPr>
-                <w:rFonts w:ascii="Times New Roman" w:hAnsi="Times New Roman" w:eastAsia="Times New Roman"/>
-                <w:b w:val="0"/>
-                <w:color w:val="000000"/>
-                <w:sz w:val="22"/>
-              </w:rPr>
-              <w:t>Исходные материалы задания</w:t>
-            </w:r>
-          </w:p>
-        </w:tc>
-        <w:tc>
-          <w:tcPr>
-            <w:tcW w:type="dxa" w:w="3118"/>
-          </w:tcPr>
-          <w:p>
-            <w:pPr>
-              <w:keepNext w:val="0"/>
-              <w:spacing w:after="60" w:before="60" w:line="240" w:lineRule="auto"/>
-            </w:pPr>
-            <w:r>
-              <w:rPr>
-                <w:rFonts w:ascii="Times New Roman" w:hAnsi="Times New Roman" w:eastAsia="Times New Roman"/>
-                <w:b w:val="0"/>
-                <w:color w:val="000000"/>
-                <w:sz w:val="22"/>
-              </w:rPr>
-              <w:t>docs/source/</w:t>
+              <w:t>docs/diagrams, reports/</w:t>
             </w:r>
           </w:p>
         </w:tc>
@@ -2178,7 +2113,7 @@
           <w:color w:val="000000"/>
           <w:sz w:val="28"/>
         </w:rPr>
-        <w:t>Используется синхронная SQLAlchemy-сессия и обычные функции def. Для небольшого учебного сервиса это проще для чтения и отладки. База не заменена встроенной SQLite. Docker Compose запускает PostgreSQL отдельно, при этом само Python-приложение может работать в venv на компьютере студента.</w:t>
+        <w:t>Используется синхронная SQLAlchemy-сессия и обычные функции def. Для небольшого учебного сервиса это проще для чтения и отладки. PostgreSQL 17 устанавливается как обычная служба операционной системы. Python-приложение работает в venv и подключается к ней через psycopg. Для запуска требуются Python и PostgreSQL.</w:t>
       </w:r>
     </w:p>
     <w:p>
@@ -6411,7 +6346,7 @@
           <w:color w:val="000000"/>
           <w:sz w:val="28"/>
         </w:rPr>
-        <w:t>Корень содержит README, файлы зависимостей, Compose и пример настроек. Каталог app объединяет сервер, client — отдельный учебный HTTP-клиент, tests — автоматические проверки, scripts — инициализацию и вспомогательные действия, docs — документацию и доказательства проверок. В storage находятся только загруженные документы, а не исходный код.</w:t>
+        <w:t>Корень содержит README, файлы зависимостей и пример настроек. Каталог app объединяет сервер, client — отдельный учебный HTTP-клиент, tests — автоматические проверки, scripts — настройку базы и вспомогательные действия, docs — готовую документацию по назначению. В storage находятся загруженные документы. Первичная настройка PostgreSQL описана в scripts/setup_database.sql.</w:t>
       </w:r>
     </w:p>
     <w:p>
@@ -9290,7 +9225,7 @@
           <w:color w:val="000000"/>
           <w:sz w:val="28"/>
         </w:rPr>
-        <w:t>Для запуска нужны Python 3.12, Docker с Compose v2 и свободные порты 5432 и 8000. Python работает в виртуальном окружении, PostgreSQL — отдельным контейнером. Установка выполняется из корня проекта по README. Сначала устанавливаются зафиксированные зависимости, затем создаётся .env со случайным JWT-ключом.</w:t>
+        <w:t>Для запуска нужны Python 3.12, установленная PostgreSQL 17 и свободные порты 5432 и 8000. PostgreSQL работает обычной службой ОС, Python — в виртуальном окружении. Установка описана в README и docs/guides/DEPLOYMENT.md для Windows, Linux и macOS. После установки зависимостей создаётся .env со случайным JWT-ключом.</w:t>
       </w:r>
     </w:p>
     <w:p>
@@ -9305,7 +9240,7 @@
           <w:color w:val="000000"/>
           <w:sz w:val="28"/>
         </w:rPr>
-        <w:t>Команда docker compose up -d --wait ждёт готовности БД. create_test_db.py создаёт отдельную базу для тестов. app.init_db --demo создаёт таблицы и вымышленные данные только в пустой базе. Повторная команда не очищает записи. Для новой базы без примеров используется init_db без --demo и ADMIN_PASSWORD из настроек.</w:t>
+        <w:t>Администратор PostgreSQL один раз выполняет scripts/setup_database.sql: создаются роль olympiad, рабочая и тестовая базы. create_test_db.py проверяет подключение к тестовой БД. Команда app.init_db --demo создаёт таблицы и вымышленные данные только в пустой базе. Повторная инициализация сохраняет записи. Для новой базы без примеров используется init_db без --demo и ADMIN_PASSWORD из настроек.</w:t>
       </w:r>
     </w:p>
     <w:p>
@@ -9368,7 +9303,7 @@
           <w:color w:val="000000"/>
           <w:sz w:val="28"/>
         </w:rPr>
-        <w:t>Информация находится в двух местах: строки — в PostgreSQL volume, документы — в storage. Для восстановления нужны обе части одного состояния. Копирование только исходников не сохраняет пользовательские загрузки, а копирование только storage не восстанавливает заявки и права.</w:t>
+        <w:t>Информация находится в двух местах: строки — в каталоге данных PostgreSQL, документы — в storage. Для восстановления нужны обе части одного состояния. Копирование только исходников не сохраняет пользовательские загрузки, а копирование только storage не восстанавливает заявки и права. Служба PostgreSQL управляется средствами операционной системы.</w:t>
       </w:r>
     </w:p>
     <w:p>
@@ -9398,7 +9333,7 @@
           <w:color w:val="000000"/>
           <w:sz w:val="28"/>
         </w:rPr>
-        <w:t>В учебном Compose база доступна только через loopback. Для эксплуатации с реальными персональными данными потребуются отдельные настройки TLS, доступа, резервного хранения и ограничения частоты входа. Нагрузочная пригодность для большого числа пользователей данным набором проверок не подтверждена.</w:t>
+        <w:t>В учебной установке PostgreSQL принимает локальные подключения с проверкой пароля. Для эксплуатации с реальными персональными данными потребуются отдельные настройки TLS, доступа, резервного хранения и ограничения частоты входа. Нагрузочная пригодность для большого числа пользователей данным набором проверок не подтверждена.</w:t>
       </w:r>
     </w:p>
     <w:p>

</xml_diff>